<commit_message>
Batch 19 — v2.1 classifier-corrected panel rerun (v1.0.0-rc3): manuscript/supplement/Table_S1_did_static.docx
</commit_message>
<xml_diff>
--- a/manuscript/supplement/Table_S1_did_static.docx
+++ b/manuscript/supplement/Table_S1_did_static.docx
@@ -736,7 +736,7 @@
                 <w:rFonts w:ascii="Arial" w:hAnsi="Arial"/>
                 <w:sz w:val="20"/>
               </w:rPr>
-              <w:t>+15.289</w:t>
+              <w:t>+15.218</w:t>
             </w:r>
           </w:p>
         </w:tc>
@@ -750,7 +750,7 @@
                 <w:rFonts w:ascii="Arial" w:hAnsi="Arial"/>
                 <w:sz w:val="20"/>
               </w:rPr>
-              <w:t>17.328</w:t>
+              <w:t>17.337</w:t>
             </w:r>
           </w:p>
         </w:tc>
@@ -764,7 +764,7 @@
                 <w:rFonts w:ascii="Arial" w:hAnsi="Arial"/>
                 <w:sz w:val="20"/>
               </w:rPr>
-              <w:t>0.882</w:t>
+              <w:t>0.878</w:t>
             </w:r>
           </w:p>
         </w:tc>
@@ -778,7 +778,7 @@
                 <w:rFonts w:ascii="Arial" w:hAnsi="Arial"/>
                 <w:sz w:val="20"/>
               </w:rPr>
-              <w:t>0.378</w:t>
+              <w:t>0.380</w:t>
             </w:r>
           </w:p>
         </w:tc>
@@ -792,7 +792,7 @@
                 <w:rFonts w:ascii="Arial" w:hAnsi="Arial"/>
                 <w:sz w:val="20"/>
               </w:rPr>
-              <w:t>-18.673</w:t>
+              <w:t>-18.762</w:t>
             </w:r>
           </w:p>
         </w:tc>
@@ -806,7 +806,7 @@
                 <w:rFonts w:ascii="Arial" w:hAnsi="Arial"/>
                 <w:sz w:val="20"/>
               </w:rPr>
-              <w:t>49.250</w:t>
+              <w:t>49.197</w:t>
             </w:r>
           </w:p>
         </w:tc>
@@ -892,7 +892,7 @@
                 <w:rFonts w:ascii="Arial" w:hAnsi="Arial"/>
                 <w:sz w:val="20"/>
               </w:rPr>
-              <w:t>-3.587</w:t>
+              <w:t>-3.623</w:t>
             </w:r>
           </w:p>
         </w:tc>
@@ -906,7 +906,7 @@
                 <w:rFonts w:ascii="Arial" w:hAnsi="Arial"/>
                 <w:sz w:val="20"/>
               </w:rPr>
-              <w:t>2.882</w:t>
+              <w:t>2.891</w:t>
             </w:r>
           </w:p>
         </w:tc>
@@ -920,7 +920,7 @@
                 <w:rFonts w:ascii="Arial" w:hAnsi="Arial"/>
                 <w:sz w:val="20"/>
               </w:rPr>
-              <w:t>-1.245</w:t>
+              <w:t>-1.253</w:t>
             </w:r>
           </w:p>
         </w:tc>
@@ -934,7 +934,7 @@
                 <w:rFonts w:ascii="Arial" w:hAnsi="Arial"/>
                 <w:sz w:val="20"/>
               </w:rPr>
-              <w:t>0.213</w:t>
+              <w:t>0.210</w:t>
             </w:r>
           </w:p>
         </w:tc>
@@ -948,7 +948,7 @@
                 <w:rFonts w:ascii="Arial" w:hAnsi="Arial"/>
                 <w:sz w:val="20"/>
               </w:rPr>
-              <w:t>-9.235</w:t>
+              <w:t>-9.289</w:t>
             </w:r>
           </w:p>
         </w:tc>
@@ -962,7 +962,7 @@
                 <w:rFonts w:ascii="Arial" w:hAnsi="Arial"/>
                 <w:sz w:val="20"/>
               </w:rPr>
-              <w:t>2.062</w:t>
+              <w:t>2.042</w:t>
             </w:r>
           </w:p>
         </w:tc>
@@ -1048,7 +1048,7 @@
                 <w:rFonts w:ascii="Arial" w:hAnsi="Arial"/>
                 <w:sz w:val="20"/>
               </w:rPr>
-              <w:t>-0.000</w:t>
+              <w:t>-0.098</w:t>
             </w:r>
           </w:p>
         </w:tc>
@@ -1062,7 +1062,7 @@
                 <w:rFonts w:ascii="Arial" w:hAnsi="Arial"/>
                 <w:sz w:val="20"/>
               </w:rPr>
-              <w:t>0.000</w:t>
+              <w:t>0.062</w:t>
             </w:r>
           </w:p>
         </w:tc>
@@ -1076,7 +1076,7 @@
                 <w:rFonts w:ascii="Arial" w:hAnsi="Arial"/>
                 <w:sz w:val="20"/>
               </w:rPr>
-              <w:t>-2.038</w:t>
+              <w:t>-1.589</w:t>
             </w:r>
           </w:p>
         </w:tc>
@@ -1090,7 +1090,7 @@
                 <w:rFonts w:ascii="Arial" w:hAnsi="Arial"/>
                 <w:sz w:val="20"/>
               </w:rPr>
-              <w:t>0.042</w:t>
+              <w:t>0.112</w:t>
             </w:r>
           </w:p>
         </w:tc>
@@ -1104,7 +1104,7 @@
                 <w:rFonts w:ascii="Arial" w:hAnsi="Arial"/>
                 <w:sz w:val="20"/>
               </w:rPr>
-              <w:t>-0.000</w:t>
+              <w:t>-0.219</w:t>
             </w:r>
           </w:p>
         </w:tc>
@@ -1118,7 +1118,7 @@
                 <w:rFonts w:ascii="Arial" w:hAnsi="Arial"/>
                 <w:sz w:val="20"/>
               </w:rPr>
-              <w:t>-0.000</w:t>
+              <w:t>0.023</w:t>
             </w:r>
           </w:p>
         </w:tc>
@@ -1132,7 +1132,7 @@
                 <w:rFonts w:ascii="Arial" w:hAnsi="Arial"/>
                 <w:sz w:val="20"/>
               </w:rPr>
-              <w:t>0.000</w:t>
+              <w:t>0.059</w:t>
             </w:r>
           </w:p>
         </w:tc>

</xml_diff>